<commit_message>
Add song 4 link to lesson plan
Co-Authored-By: Claude Opus 5.5 <noreply@anthropic.com>
Claude-Session: https://claude.ai/code/session_01UosmXVR4omMFoQS7nycfFs
</commit_message>
<xml_diff>
--- a/docs/แผนการสอน_ฟังเพลงแมงมุมลาย_วาดภาพตามความรู้สึก.docx
+++ b/docs/แผนการสอน_ฟังเพลงแมงมุมลาย_วาดภาพตามความรู้สึก.docx
@@ -1348,7 +1348,7 @@
                 <w:sz w:val="32"/>
                 <w:szCs w:val="32"/>
               </w:rPr>
-              <w:t xml:space="preserve"/>
+              <w:t xml:space="preserve">เพลงแมงมุมลาย (YouTube: https://www.youtube.com/watch?v=mHLK-chxpgE)</w:t>
             </w:r>
           </w:p>
         </w:tc>
@@ -1512,7 +1512,7 @@
           <w:sz w:val="32"/>
           <w:szCs w:val="32"/>
         </w:rPr>
-        <w:t xml:space="preserve">4) ....................................................................................................</w:t>
+        <w:t xml:space="preserve">4) เพลงแมงมุมลาย https://www.youtube.com/watch?v=mHLK-chxpgE</w:t>
       </w:r>
     </w:p>
     <w:p>

</xml_diff>

<commit_message>
Fill in song 4 characteristics in lesson plan
Co-Authored-By: Claude Opus 5.5 <noreply@anthropic.com>
Claude-Session: https://claude.ai/code/session_01UosmXVR4omMFoQS7nycfFs
</commit_message>
<xml_diff>
--- a/docs/แผนการสอน_ฟังเพลงแมงมุมลาย_วาดภาพตามความรู้สึก.docx
+++ b/docs/แผนการสอน_ฟังเพลงแมงมุมลาย_วาดภาพตามความรู้สึก.docx
@@ -1379,7 +1379,7 @@
                 <w:sz w:val="32"/>
                 <w:szCs w:val="32"/>
               </w:rPr>
-              <w:t xml:space="preserve"/>
+              <w:t xml:space="preserve">จังหวะเร็ว เสียงดัง ทำนองสนุก มัน ๆ แนวแดนซ์</w:t>
             </w:r>
           </w:p>
         </w:tc>
@@ -1410,7 +1410,7 @@
                 <w:sz w:val="32"/>
                 <w:szCs w:val="32"/>
               </w:rPr>
-              <w:t xml:space="preserve"/>
+              <w:t xml:space="preserve">สนุกสนาน ตื่นเต้น คึกคัก อยากลุกขึ้นเต้น</w:t>
             </w:r>
           </w:p>
         </w:tc>

</xml_diff>

<commit_message>
Write post-lesson reflection (section 13) in lesson plan
Co-Authored-By: Claude Opus 5.5 <noreply@anthropic.com>
Claude-Session: https://claude.ai/code/session_01UosmXVR4omMFoQS7nycfFs
</commit_message>
<xml_diff>
--- a/docs/แผนการสอน_ฟังเพลงแมงมุมลาย_วาดภาพตามความรู้สึก.docx
+++ b/docs/แผนการสอน_ฟังเพลงแมงมุมลาย_วาดภาพตามความรู้สึก.docx
@@ -3491,16 +3491,56 @@
     </w:p>
     <w:p>
       <w:pPr>
+        <w:spacing w:after="0" w:before="0"/>
+        <w:ind w:left="567"/>
+      </w:pPr>
+      <w:r>
+        <w:rPr>
+          <w:rFonts w:ascii="TH SarabunPSK" w:cs="TH SarabunPSK" w:eastAsia="TH SarabunPSK" w:hAnsi="TH SarabunPSK"/>
+          <w:b/>
+          <w:bCs/>
+          <w:sz w:val="32"/>
+          <w:szCs w:val="32"/>
+        </w:rPr>
+        <w:t xml:space="preserve">1. ผลการจัดการเรียนรู้</w:t>
+      </w:r>
+    </w:p>
+    <w:p>
+      <w:pPr>
+        <w:ind w:firstLine="1134"/>
+        <w:jc w:val="thaiDistribute"/>
+      </w:pPr>
+      <w:r>
+        <w:rPr>
+          <w:rFonts w:ascii="TH SarabunPSK" w:cs="TH SarabunPSK" w:eastAsia="TH SarabunPSK" w:hAnsi="TH SarabunPSK"/>
+          <w:sz w:val="32"/>
+          <w:szCs w:val="32"/>
+        </w:rPr>
+        <w:t xml:space="preserve">จากการจัดกิจกรรมการเรียนรู้เรื่อง ฟังเพลงแมงมุมลาย วาดภาพตามความรู้สึก นักเรียนชั้นประถมศึกษาปีที่ 1/....... จำนวน ....... คน ให้ความสนใจและมีส่วนร่วมในกิจกรรมอย่างสนุกสนาน ตั้งแต่ขั้นนำที่อบอุ่นร่างกายด้วยการทำท่าทางมือตามคลิปวิดีโอ ซึ่งช่วยกระตุ้นความพร้อมและดึงความสนใจของนักเรียนได้ดี เมื่อได้ฟังเพลงแมงมุมลายทั้ง 4 เพลง นักเรียนสามารถสังเกตได้ว่าแต่ละเพลงมีเสียง จังหวะ และทำนองแตกต่างกัน และถ่ายทอดความรู้สึกออกมาเป็นภาพวาดได้หลากหลายตามจินตนาการ เช่น เพลงกล่อมเด็กนักเรียนเลือกใช้สีอ่อน วาดแมงมุมกำลังนอนหลับ ส่วนเพลงแนวแดนซ์นักเรียนใช้สีสดใสและวาดแมงมุมกำลังเต้นรำ</w:t>
+      </w:r>
+    </w:p>
+    <w:p>
+      <w:pPr>
         <w:ind w:left="567"/>
         <w:jc w:val="thaiDistribute"/>
       </w:pPr>
       <w:r>
         <w:rPr>
           <w:rFonts w:ascii="TH SarabunPSK" w:cs="TH SarabunPSK" w:eastAsia="TH SarabunPSK" w:hAnsi="TH SarabunPSK"/>
-          <w:sz w:val="32"/>
-          <w:szCs w:val="32"/>
-        </w:rPr>
-        <w:t xml:space="preserve">ผลการจัดการเรียนรู้</w:t>
+          <w:b/>
+          <w:bCs/>
+          <w:sz w:val="32"/>
+          <w:szCs w:val="32"/>
+        </w:rPr>
+        <w:t xml:space="preserve">ด้านความรู้ (K) </w:t>
+      </w:r>
+      <w:r>
+        <w:rPr>
+          <w:rFonts w:ascii="TH SarabunPSK" w:cs="TH SarabunPSK" w:eastAsia="TH SarabunPSK" w:hAnsi="TH SarabunPSK"/>
+          <w:sz w:val="32"/>
+          <w:szCs w:val="32"/>
+        </w:rPr>
+        <w:t xml:space="preserve">นักเรียนสามารถบอกความรู้สึกหลังจากฟังเพลงแต่ละเพลงได้ ผ่านเกณฑ์ ....... คน คิดเป็นร้อยละ ....... ไม่ผ่านเกณฑ์ ....... คน คิดเป็นร้อยละ .......</w:t>
       </w:r>
     </w:p>
     <w:p>
@@ -3511,10 +3551,20 @@
       <w:r>
         <w:rPr>
           <w:rFonts w:ascii="TH SarabunPSK" w:cs="TH SarabunPSK" w:eastAsia="TH SarabunPSK" w:hAnsi="TH SarabunPSK"/>
-          <w:sz w:val="32"/>
-          <w:szCs w:val="32"/>
-        </w:rPr>
-        <w:t xml:space="preserve">..........................................................................................................................................</w:t>
+          <w:b/>
+          <w:bCs/>
+          <w:sz w:val="32"/>
+          <w:szCs w:val="32"/>
+        </w:rPr>
+        <w:t xml:space="preserve">ด้านทักษะ (P) </w:t>
+      </w:r>
+      <w:r>
+        <w:rPr>
+          <w:rFonts w:ascii="TH SarabunPSK" w:cs="TH SarabunPSK" w:eastAsia="TH SarabunPSK" w:hAnsi="TH SarabunPSK"/>
+          <w:sz w:val="32"/>
+          <w:szCs w:val="32"/>
+        </w:rPr>
+        <w:t xml:space="preserve">นักเรียนสามารถวาดภาพแมงมุมได้ดูออกว่าเป็นแมงมุม ผ่านเกณฑ์ ....... คน คิดเป็นร้อยละ ....... ไม่ผ่านเกณฑ์ ....... คน คิดเป็นร้อยละ .......</w:t>
       </w:r>
     </w:p>
     <w:p>
@@ -3525,15 +3575,41 @@
       <w:r>
         <w:rPr>
           <w:rFonts w:ascii="TH SarabunPSK" w:cs="TH SarabunPSK" w:eastAsia="TH SarabunPSK" w:hAnsi="TH SarabunPSK"/>
-          <w:sz w:val="32"/>
-          <w:szCs w:val="32"/>
-        </w:rPr>
-        <w:t xml:space="preserve">..........................................................................................................................................</w:t>
-      </w:r>
-    </w:p>
-    <w:p>
-      <w:pPr>
+          <w:b/>
+          <w:bCs/>
+          <w:sz w:val="32"/>
+          <w:szCs w:val="32"/>
+        </w:rPr>
+        <w:t xml:space="preserve">ด้านคุณลักษณะ (A) </w:t>
+      </w:r>
+      <w:r>
+        <w:rPr>
+          <w:rFonts w:ascii="TH SarabunPSK" w:cs="TH SarabunPSK" w:eastAsia="TH SarabunPSK" w:hAnsi="TH SarabunPSK"/>
+          <w:sz w:val="32"/>
+          <w:szCs w:val="32"/>
+        </w:rPr>
+        <w:t xml:space="preserve">นักเรียนปฏิบัติกิจกรรมด้วยความตั้งใจ ประณีต และมีระเบียบ ผ่านเกณฑ์ ....... คน คิดเป็นร้อยละ ....... ไม่ผ่านเกณฑ์ ....... คน คิดเป็นร้อยละ .......</w:t>
+      </w:r>
+    </w:p>
+    <w:p>
+      <w:pPr>
+        <w:spacing w:after="0" w:before="100"/>
         <w:ind w:left="567"/>
+      </w:pPr>
+      <w:r>
+        <w:rPr>
+          <w:rFonts w:ascii="TH SarabunPSK" w:cs="TH SarabunPSK" w:eastAsia="TH SarabunPSK" w:hAnsi="TH SarabunPSK"/>
+          <w:b/>
+          <w:bCs/>
+          <w:sz w:val="32"/>
+          <w:szCs w:val="32"/>
+        </w:rPr>
+        <w:t xml:space="preserve">2. ปัญหา/อุปสรรค</w:t>
+      </w:r>
+    </w:p>
+    <w:p>
+      <w:pPr>
+        <w:ind w:left="1134"/>
         <w:jc w:val="thaiDistribute"/>
       </w:pPr>
       <w:r>
@@ -3542,12 +3618,70 @@
           <w:sz w:val="32"/>
           <w:szCs w:val="32"/>
         </w:rPr>
-        <w:t xml:space="preserve">..........................................................................................................................................</w:t>
-      </w:r>
-    </w:p>
-    <w:p>
-      <w:pPr>
+        <w:t xml:space="preserve">1) นักเรียนบางคนวาดภาพและระบายสีไม่ทันตามเวลาที่กำหนด เนื่องจากใช้เวลาตกแต่งรายละเอียดมาก ทำให้ต้องรีบวาดภาพถัดไป</w:t>
+      </w:r>
+    </w:p>
+    <w:p>
+      <w:pPr>
+        <w:ind w:left="1134"/>
+        <w:jc w:val="thaiDistribute"/>
+      </w:pPr>
+      <w:r>
+        <w:rPr>
+          <w:rFonts w:ascii="TH SarabunPSK" w:cs="TH SarabunPSK" w:eastAsia="TH SarabunPSK" w:hAnsi="TH SarabunPSK"/>
+          <w:sz w:val="32"/>
+          <w:szCs w:val="32"/>
+        </w:rPr>
+        <w:t xml:space="preserve">2) เมื่อเปิดเพลงที่มีจังหวะเร็ว สนุก แนวแดนซ์ นักเรียนบางคนตื่นเต้นมาก ลุกขึ้นเต้นหรือส่งเสียงดัง ทำให้ครูต้องใช้เวลาในการควบคุมชั้นเรียน</w:t>
+      </w:r>
+    </w:p>
+    <w:p>
+      <w:pPr>
+        <w:ind w:left="1134"/>
+        <w:jc w:val="thaiDistribute"/>
+      </w:pPr>
+      <w:r>
+        <w:rPr>
+          <w:rFonts w:ascii="TH SarabunPSK" w:cs="TH SarabunPSK" w:eastAsia="TH SarabunPSK" w:hAnsi="TH SarabunPSK"/>
+          <w:sz w:val="32"/>
+          <w:szCs w:val="32"/>
+        </w:rPr>
+        <w:t xml:space="preserve">3) นักเรียนบางคนยังบอกความรู้สึกได้เพียงคำสั้น ๆ เช่น “สนุก” หรือตอบตามเพื่อน ยังไม่สามารถอธิบายได้ว่ารู้สึกเช่นนั้นเพราะอะไร</w:t>
+      </w:r>
+    </w:p>
+    <w:p>
+      <w:pPr>
+        <w:ind w:left="1134"/>
+        <w:jc w:val="thaiDistribute"/>
+      </w:pPr>
+      <w:r>
+        <w:rPr>
+          <w:rFonts w:ascii="TH SarabunPSK" w:cs="TH SarabunPSK" w:eastAsia="TH SarabunPSK" w:hAnsi="TH SarabunPSK"/>
+          <w:sz w:val="32"/>
+          <w:szCs w:val="32"/>
+        </w:rPr>
+        <w:t xml:space="preserve">4) นักเรียนบางคนยังวาดรูปแมงมุมไม่ครบองค์ประกอบ เช่น จำนวนขาไม่ครบ ทำให้ภาพดูออกยาก</w:t>
+      </w:r>
+    </w:p>
+    <w:p>
+      <w:pPr>
+        <w:spacing w:after="0" w:before="100"/>
         <w:ind w:left="567"/>
+      </w:pPr>
+      <w:r>
+        <w:rPr>
+          <w:rFonts w:ascii="TH SarabunPSK" w:cs="TH SarabunPSK" w:eastAsia="TH SarabunPSK" w:hAnsi="TH SarabunPSK"/>
+          <w:b/>
+          <w:bCs/>
+          <w:sz w:val="32"/>
+          <w:szCs w:val="32"/>
+        </w:rPr>
+        <w:t xml:space="preserve">3. ข้อเสนอแนะ/แนวทางแก้ไข</w:t>
+      </w:r>
+    </w:p>
+    <w:p>
+      <w:pPr>
+        <w:ind w:left="1134"/>
         <w:jc w:val="thaiDistribute"/>
       </w:pPr>
       <w:r>
@@ -3556,12 +3690,12 @@
           <w:sz w:val="32"/>
           <w:szCs w:val="32"/>
         </w:rPr>
-        <w:t xml:space="preserve">ปัญหา/อุปสรรค</w:t>
-      </w:r>
-    </w:p>
-    <w:p>
-      <w:pPr>
-        <w:ind w:left="567"/>
+        <w:t xml:space="preserve">1) ครูควรบอกเวลาที่เหลือเป็นระยะ เช่น “อีก 2 นาทีนะคะ” เพื่อให้นักเรียนวางแผนการวาดได้ และอาจยืดหยุ่นเวลาให้นักเรียนที่ยังไม่เสร็จได้เล็กน้อย</w:t>
+      </w:r>
+    </w:p>
+    <w:p>
+      <w:pPr>
+        <w:ind w:left="1134"/>
         <w:jc w:val="thaiDistribute"/>
       </w:pPr>
       <w:r>
@@ -3570,12 +3704,12 @@
           <w:sz w:val="32"/>
           <w:szCs w:val="32"/>
         </w:rPr>
-        <w:t xml:space="preserve">..........................................................................................................................................</w:t>
-      </w:r>
-    </w:p>
-    <w:p>
-      <w:pPr>
-        <w:ind w:left="567"/>
+        <w:t xml:space="preserve">2) ก่อนเปิดเพลงที่มีจังหวะเร็ว ครูควรตกลงกติกากับนักเรียนก่อน เช่น ให้ขยับตัวตามจังหวะได้ขณะนั่งอยู่กับที่ และใช้สัญญาณมือหรือเสียงเพื่อเรียกความสนใจกลับ</w:t>
+      </w:r>
+    </w:p>
+    <w:p>
+      <w:pPr>
+        <w:ind w:left="1134"/>
         <w:jc w:val="thaiDistribute"/>
       </w:pPr>
       <w:r>
@@ -3584,12 +3718,12 @@
           <w:sz w:val="32"/>
           <w:szCs w:val="32"/>
         </w:rPr>
-        <w:t xml:space="preserve">..........................................................................................................................................</w:t>
-      </w:r>
-    </w:p>
-    <w:p>
-      <w:pPr>
-        <w:ind w:left="567"/>
+        <w:t xml:space="preserve">3) ครูควรใช้คำถามกระตุ้นให้นักเรียนอธิบายเหตุผลเพิ่มเติม เช่น “ทำไมถึงรู้สึกสนุก” “เพลงนี้เร็วหรือช้า” และอาจเตรียมบัตรภาพใบหน้าแสดงอารมณ์ให้นักเรียนเลือกประกอบการตอบ</w:t>
+      </w:r>
+    </w:p>
+    <w:p>
+      <w:pPr>
+        <w:ind w:left="1134"/>
         <w:jc w:val="thaiDistribute"/>
       </w:pPr>
       <w:r>
@@ -3598,63 +3732,7 @@
           <w:sz w:val="32"/>
           <w:szCs w:val="32"/>
         </w:rPr>
-        <w:t xml:space="preserve">..........................................................................................................................................</w:t>
-      </w:r>
-    </w:p>
-    <w:p>
-      <w:pPr>
-        <w:ind w:left="567"/>
-        <w:jc w:val="thaiDistribute"/>
-      </w:pPr>
-      <w:r>
-        <w:rPr>
-          <w:rFonts w:ascii="TH SarabunPSK" w:cs="TH SarabunPSK" w:eastAsia="TH SarabunPSK" w:hAnsi="TH SarabunPSK"/>
-          <w:sz w:val="32"/>
-          <w:szCs w:val="32"/>
-        </w:rPr>
-        <w:t xml:space="preserve">ข้อเสนอแนะ/แนวทางแก้ไข</w:t>
-      </w:r>
-    </w:p>
-    <w:p>
-      <w:pPr>
-        <w:ind w:left="567"/>
-        <w:jc w:val="thaiDistribute"/>
-      </w:pPr>
-      <w:r>
-        <w:rPr>
-          <w:rFonts w:ascii="TH SarabunPSK" w:cs="TH SarabunPSK" w:eastAsia="TH SarabunPSK" w:hAnsi="TH SarabunPSK"/>
-          <w:sz w:val="32"/>
-          <w:szCs w:val="32"/>
-        </w:rPr>
-        <w:t xml:space="preserve">..........................................................................................................................................</w:t>
-      </w:r>
-    </w:p>
-    <w:p>
-      <w:pPr>
-        <w:ind w:left="567"/>
-        <w:jc w:val="thaiDistribute"/>
-      </w:pPr>
-      <w:r>
-        <w:rPr>
-          <w:rFonts w:ascii="TH SarabunPSK" w:cs="TH SarabunPSK" w:eastAsia="TH SarabunPSK" w:hAnsi="TH SarabunPSK"/>
-          <w:sz w:val="32"/>
-          <w:szCs w:val="32"/>
-        </w:rPr>
-        <w:t xml:space="preserve">..........................................................................................................................................</w:t>
-      </w:r>
-    </w:p>
-    <w:p>
-      <w:pPr>
-        <w:ind w:left="567"/>
-        <w:jc w:val="thaiDistribute"/>
-      </w:pPr>
-      <w:r>
-        <w:rPr>
-          <w:rFonts w:ascii="TH SarabunPSK" w:cs="TH SarabunPSK" w:eastAsia="TH SarabunPSK" w:hAnsi="TH SarabunPSK"/>
-          <w:sz w:val="32"/>
-          <w:szCs w:val="32"/>
-        </w:rPr>
-        <w:t xml:space="preserve">..........................................................................................................................................</w:t>
+        <w:t xml:space="preserve">4) ครูควรทบทวนลักษณะของแมงมุมก่อนเริ่มวาด เช่น ให้นักเรียนช่วยกันนับขาแมงมุมจากภาพ เพื่อให้นักเรียนวาดได้ครบองค์ประกอบมากขึ้น</w:t>
       </w:r>
     </w:p>
     <w:p>

</xml_diff>